<commit_message>
docs: update meeting notes and variable recording export plan
</commit_message>
<xml_diff>
--- a/00_start_materials/第五次开会/第5次开会会议记录.docx
+++ b/00_start_materials/第五次开会/第5次开会会议记录.docx
@@ -89,11 +89,182 @@
       </w:r>
     </w:p>
     <w:p>
-      <w:r>
-        <w:rPr>
-          <w:rFonts w:hint="eastAsia"/>
-        </w:rPr>
-        <w:t>目前按照共享随机序列，一组的AB按照一个序列分配公司</w:t>
+      <w:pPr>
+        <w:rPr>
+          <w:rFonts w:hint="eastAsia"/>
+        </w:rPr>
+      </w:pPr>
+      <w:r>
+        <w:rPr>
+          <w:rFonts w:hint="eastAsia"/>
+        </w:rPr>
+        <w:t>放弃</w:t>
+      </w:r>
+      <w:r>
+        <w:rPr>
+          <w:rFonts w:hint="eastAsia"/>
+        </w:rPr>
+        <w:t>共享随机序列</w:t>
+      </w:r>
+    </w:p>
+    <w:p>
+      <w:pPr>
+        <w:rPr>
+          <w:rFonts w:hint="eastAsia"/>
+        </w:rPr>
+      </w:pPr>
+      <w:r>
+        <w:rPr>
+          <w:rFonts w:hint="eastAsia"/>
+        </w:rPr>
+        <w:t>改用公司池制度-对A来说</w:t>
+      </w:r>
+      <w:r>
+        <w:rPr>
+          <w:rFonts w:hint="eastAsia"/>
+        </w:rPr>
+        <w:t>团队之间随机分配推送顺序</w:t>
+      </w:r>
+      <w:r>
+        <w:rPr>
+          <w:rFonts w:hint="eastAsia"/>
+        </w:rPr>
+        <w:t>；对</w:t>
+      </w:r>
+      <w:r>
+        <w:rPr>
+          <w:rFonts w:hint="eastAsia"/>
+        </w:rPr>
+        <w:t>B</w:t>
+      </w:r>
+      <w:r>
+        <w:rPr>
+          <w:rFonts w:hint="eastAsia"/>
+        </w:rPr>
+        <w:t>来说，</w:t>
+      </w:r>
+      <w:r>
+        <w:rPr>
+          <w:rFonts w:hint="eastAsia"/>
+        </w:rPr>
+        <w:t>推送顺序取决于公司池，如果公司池只有一家，就直接推送；如果有超过一家，随机推送一家；如果公司池没有，推送A正在处理的公司</w:t>
+      </w:r>
+    </w:p>
+    <w:p>
+      <w:pPr>
+        <w:rPr>
+          <w:rFonts w:hint="eastAsia"/>
+        </w:rPr>
+      </w:pPr>
+      <w:r>
+        <w:rPr>
+          <w:rFonts w:hint="eastAsia"/>
+        </w:rPr>
+        <w:t>————</w:t>
+      </w:r>
+    </w:p>
+    <w:p>
+      <w:pPr>
+        <w:rPr>
+          <w:rFonts w:hint="eastAsia"/>
+        </w:rPr>
+      </w:pPr>
+      <w:r>
+        <w:rPr>
+          <w:rFonts w:hint="eastAsia"/>
+        </w:rPr>
+        <w:t>B 完成当前公司 →</w:t>
+      </w:r>
+    </w:p>
+    <w:p>
+      <w:pPr>
+        <w:rPr>
+          <w:rFonts w:hint="eastAsia"/>
+        </w:rPr>
+      </w:pPr>
+      <w:r>
+        <w:rPr>
+          <w:rFonts w:hint="eastAsia"/>
+        </w:rPr>
+        <w:t xml:space="preserve">  if 锁定池 (A已提交 &amp;&amp; B未完成 &amp;&amp; B未分配) 非空:</w:t>
+      </w:r>
+    </w:p>
+    <w:p>
+      <w:pPr>
+        <w:rPr>
+          <w:rFonts w:hint="eastAsia"/>
+        </w:rPr>
+      </w:pPr>
+      <w:r>
+        <w:rPr>
+          <w:rFonts w:hint="eastAsia"/>
+        </w:rPr>
+        <w:t xml:space="preserve">    从池中随机选一家 → 分配给 B</w:t>
+      </w:r>
+    </w:p>
+    <w:p>
+      <w:pPr>
+        <w:rPr>
+          <w:rFonts w:hint="eastAsia"/>
+        </w:rPr>
+      </w:pPr>
+      <w:r>
+        <w:rPr>
+          <w:rFonts w:hint="eastAsia"/>
+        </w:rPr>
+        <w:t xml:space="preserve">  else if A 正在处理的公司存在 &amp;&amp; B尚未被分配到该公司:</w:t>
+      </w:r>
+    </w:p>
+    <w:p>
+      <w:pPr>
+        <w:rPr>
+          <w:rFonts w:hint="eastAsia"/>
+        </w:rPr>
+      </w:pPr>
+      <w:r>
+        <w:rPr>
+          <w:rFonts w:hint="eastAsia"/>
+        </w:rPr>
+        <w:t xml:space="preserve">    分配该公司给 B（PreA 模式，已有）</w:t>
+      </w:r>
+    </w:p>
+    <w:p>
+      <w:pPr>
+        <w:rPr>
+          <w:rFonts w:hint="eastAsia"/>
+        </w:rPr>
+      </w:pPr>
+      <w:r>
+        <w:rPr>
+          <w:rFonts w:hint="eastAsia"/>
+        </w:rPr>
+        <w:t xml:space="preserve">  else:</w:t>
+      </w:r>
+    </w:p>
+    <w:p>
+      <w:pPr>
+        <w:rPr>
+          <w:rFonts w:hint="eastAsia"/>
+        </w:rPr>
+      </w:pPr>
+      <w:r>
+        <w:rPr>
+          <w:rFonts w:hint="eastAsia"/>
+        </w:rPr>
+        <w:t xml:space="preserve">    B 进入空窗等待（因为B会始终慢于A所以实际不存在这一步）</w:t>
+      </w:r>
+    </w:p>
+    <w:p>
+      <w:pPr>
+        <w:rPr>
+          <w:rFonts w:hint="eastAsia"/>
+        </w:rPr>
+      </w:pPr>
+      <w:r>
+        <w:rPr>
+          <w:rFonts w:hint="eastAsia"/>
+        </w:rPr>
+        <w:t>————</w:t>
       </w:r>
     </w:p>
     <w:p>
@@ -319,8 +490,33 @@
         </w:rPr>
         <w:t xml:space="preserve"> </w:t>
       </w:r>
-    </w:p>
-    <w:p>
+      <w:r>
+        <w:rPr>
+          <w:rFonts w:ascii="Segoe UI Emoji" w:hAnsi="Segoe UI Emoji" w:cs="Segoe UI Emoji" w:hint="eastAsia"/>
+          <w:b/>
+          <w:bCs/>
+          <w:sz w:val="28"/>
+          <w:szCs w:val="32"/>
+        </w:rPr>
+        <w:t>✅</w:t>
+      </w:r>
+      <w:r>
+        <w:rPr>
+          <w:rFonts w:ascii="Segoe UI Emoji" w:hAnsi="Segoe UI Emoji" w:cs="Segoe UI Emoji" w:hint="eastAsia"/>
+          <w:b/>
+          <w:bCs/>
+          <w:sz w:val="28"/>
+          <w:szCs w:val="32"/>
+        </w:rPr>
+        <w:t>️</w:t>
+      </w:r>
+    </w:p>
+    <w:p>
+      <w:pPr>
+        <w:rPr>
+          <w:rFonts w:hint="eastAsia"/>
+        </w:rPr>
+      </w:pPr>
       <w:r>
         <w:rPr>
           <w:rFonts w:hint="eastAsia"/>
@@ -334,68 +530,17 @@
           <w:rFonts w:hint="eastAsia"/>
         </w:rPr>
       </w:pPr>
-    </w:p>
-    <w:p>
-      <w:r>
-        <w:rPr>
-          <w:rFonts w:hint="eastAsia"/>
-        </w:rPr>
-        <w:t>"E:\Own_program\multi cooperation\02_specs\02_backend\VARIABLE_PERSISTENCE_SPEC.md"</w:t>
-      </w:r>
-    </w:p>
-    <w:p>
-      <w:pPr>
-        <w:rPr>
-          <w:rFonts w:hint="eastAsia"/>
-        </w:rPr>
-      </w:pPr>
-      <w:r>
-        <w:rPr>
-          <w:rFonts w:hint="eastAsia"/>
-        </w:rPr>
-        <w:t>理解目前副线任务的逻辑，见progress.md</w:t>
-      </w:r>
-    </w:p>
-    <w:p>
-      <w:pPr>
-        <w:outlineLvl w:val="1"/>
-        <w:rPr>
-          <w:rFonts w:hint="eastAsia"/>
-          <w:b/>
-          <w:bCs/>
-          <w:sz w:val="28"/>
-          <w:szCs w:val="32"/>
-        </w:rPr>
-      </w:pPr>
-      <w:r>
-        <w:rPr>
-          <w:rFonts w:hint="eastAsia"/>
-          <w:b/>
-          <w:bCs/>
-          <w:sz w:val="28"/>
-          <w:szCs w:val="32"/>
-        </w:rPr>
-        <w:t>4.</w:t>
-      </w:r>
-      <w:r>
-        <w:rPr>
-          <w:rFonts w:hint="eastAsia"/>
-          <w:b/>
-          <w:bCs/>
-          <w:sz w:val="28"/>
-          <w:szCs w:val="32"/>
-        </w:rPr>
-        <w:t>三章实验</w:t>
-      </w:r>
-      <w:r>
-        <w:rPr>
-          <w:rFonts w:hint="eastAsia"/>
-          <w:b/>
-          <w:bCs/>
-          <w:sz w:val="28"/>
-          <w:szCs w:val="32"/>
-        </w:rPr>
-        <w:t>-实验的切换</w:t>
+      <w:r>
+        <w:rPr>
+          <w:rFonts w:hint="eastAsia"/>
+        </w:rPr>
+        <w:t>理解目前副线任务的逻辑，见</w:t>
+      </w:r>
+      <w:r>
+        <w:rPr>
+          <w:rFonts w:hint="eastAsia"/>
+        </w:rPr>
+        <w:t>app_flow.md</w:t>
       </w:r>
     </w:p>
     <w:p>
@@ -421,7 +566,20 @@
         <w:rPr>
           <w:rFonts w:hint="eastAsia"/>
         </w:rPr>
-        <w:t>任务二：加三章实验的流程的功能</w:t>
+        <w:t>到达节奏（变量 A）：同样 40 条题，是逐条陆续到（continuous）还是分批集中到（batch）</w:t>
+      </w:r>
+    </w:p>
+    <w:p>
+      <w:pPr>
+        <w:rPr>
+          <w:rFonts w:hint="eastAsia"/>
+        </w:rPr>
+      </w:pPr>
+      <w:r>
+        <w:rPr>
+          <w:rFonts w:hint="eastAsia"/>
+        </w:rPr>
+        <w:t>叙事组别（变量 B）：团队看到的副线题是纯中性（neutral_info）还是掺入合作叙事（coop_narrative）</w:t>
       </w:r>
     </w:p>
     <w:p>
@@ -439,178 +597,9 @@
     </w:p>
     <w:p>
       <w:pPr>
-        <w:rPr>
-          <w:rFonts w:hint="eastAsia"/>
-        </w:rPr>
-      </w:pPr>
-      <w:r>
-        <w:rPr>
-          <w:rFonts w:hint="eastAsia"/>
-        </w:rPr>
-        <w:t>任务二请详细阅读"E:\Own_program\multi cooperation\00_start_materials\第五次开会\B实验方法_随机化处理说明_废弃.md"，从## 五、实验局 1：AI 能力升级随机化,到## 六、实验局 2：副线到达节奏随机化 再到## 七、实验局 3：合作叙事随机化 这三个实验是我们之前未曾考虑的</w:t>
-      </w:r>
-    </w:p>
-    <w:p>
-      <w:r>
-        <w:rPr>
-          <w:rFonts w:hint="eastAsia"/>
-        </w:rPr>
-        <w:t>我设想的是-最小化改动，利用目前已经做好的程序最小化改动，比如我们在admin界面可以选择目前实验1实验二实验三，然后我们根据参数调整我们的主线实验实现实验123的区分，你觉得呢，阅读md做一下规划吧？</w:t>
-      </w:r>
-    </w:p>
-    <w:p/>
-    <w:p>
-      <w:pPr>
-        <w:rPr>
-          <w:rFonts w:hint="eastAsia"/>
-        </w:rPr>
-      </w:pPr>
-      <w:r>
-        <w:rPr>
-          <w:rFonts w:hint="eastAsia"/>
-        </w:rPr>
-        <w:t>*注：指导语实验一这里-在ai升级中间的那个休息页面的指导语要告诉被试ai升级了！以及是否有必要升级版在ai区专门加个小框框在ai区功能区的全屏键左边表示【升级版】呢？</w:t>
-      </w:r>
-    </w:p>
-    <w:p>
-      <w:pPr>
-        <w:outlineLvl w:val="1"/>
-        <w:rPr>
-          <w:rFonts w:hint="eastAsia"/>
-          <w:b/>
-          <w:bCs/>
-          <w:sz w:val="28"/>
-          <w:szCs w:val="32"/>
-        </w:rPr>
-      </w:pPr>
-      <w:r>
-        <w:rPr>
-          <w:rFonts w:hint="eastAsia"/>
-          <w:b/>
-          <w:bCs/>
-          <w:sz w:val="28"/>
-          <w:szCs w:val="32"/>
-        </w:rPr>
-        <w:t>4.</w:t>
-      </w:r>
-      <w:r>
-        <w:rPr>
-          <w:rFonts w:hint="eastAsia"/>
-          <w:b/>
-          <w:bCs/>
-          <w:sz w:val="28"/>
-          <w:szCs w:val="32"/>
-        </w:rPr>
-        <w:t>变量记录模块</w:t>
-      </w:r>
-    </w:p>
-    <w:p>
-      <w:pPr>
-        <w:rPr>
-          <w:rFonts w:hint="eastAsia"/>
-        </w:rPr>
-      </w:pPr>
-      <w:r>
-        <w:rPr>
-          <w:rFonts w:hint="eastAsia"/>
-        </w:rPr>
-        <w:t>————</w:t>
-      </w:r>
-    </w:p>
-    <w:p>
-      <w:pPr>
-        <w:rPr>
-          <w:rFonts w:hint="eastAsia"/>
-        </w:rPr>
-      </w:pPr>
-      <w:r>
-        <w:rPr>
-          <w:rFonts w:hint="eastAsia"/>
-        </w:rPr>
-        <w:t>任务三：变量记录模块</w:t>
-      </w:r>
-    </w:p>
-    <w:p>
-      <w:pPr>
-        <w:rPr>
-          <w:rFonts w:hint="eastAsia"/>
-        </w:rPr>
-      </w:pPr>
-      <w:r>
-        <w:rPr>
-          <w:rFonts w:hint="eastAsia"/>
-        </w:rPr>
-        <w:t>————</w:t>
-      </w:r>
-    </w:p>
-    <w:p>
-      <w:r>
-        <w:rPr>
-          <w:rFonts w:hint="eastAsia"/>
-        </w:rPr>
-        <w:t>我估计这一块需要我们做一个详细详细的实验流程梳理，然后把每一步都思考有什么可以记录的参数都记下来，后面再搞</w:t>
-      </w:r>
-    </w:p>
-    <w:p>
-      <w:pPr>
-        <w:rPr>
-          <w:rFonts w:hint="eastAsia"/>
-        </w:rPr>
-      </w:pPr>
-      <w:r>
-        <w:rPr>
-          <w:rFonts w:hint="eastAsia"/>
-        </w:rPr>
-        <w:t>尽可能记录更多的时间戳</w:t>
-      </w:r>
-    </w:p>
-    <w:p>
-      <w:pPr>
-        <w:rPr>
-          <w:rFonts w:hint="eastAsia"/>
-        </w:rPr>
-      </w:pPr>
-      <w:r>
-        <w:rPr>
-          <w:rFonts w:hint="eastAsia"/>
-        </w:rPr>
-        <w:t>"E:\Own_program\multi cooperation\00_start_materials\第五次开会\D变量表_整理版.md"</w:t>
-      </w:r>
-    </w:p>
-    <w:p>
-      <w:pPr>
-        <w:outlineLvl w:val="1"/>
-        <w:rPr>
-          <w:rFonts w:hint="eastAsia"/>
-        </w:rPr>
-      </w:pPr>
-      <w:r>
-        <w:rPr>
-          <w:rFonts w:hint="eastAsia"/>
-          <w:b/>
-          <w:bCs/>
-          <w:sz w:val="28"/>
-          <w:szCs w:val="32"/>
-        </w:rPr>
-        <w:t>5.</w:t>
-      </w:r>
-      <w:r>
-        <w:rPr>
-          <w:rFonts w:hint="eastAsia"/>
-          <w:b/>
-          <w:bCs/>
-          <w:sz w:val="28"/>
-          <w:szCs w:val="32"/>
-        </w:rPr>
-        <w:t>服务器与域名事宜</w:t>
-      </w:r>
-    </w:p>
-    <w:p>
-      <w:pPr>
-        <w:rPr>
-          <w:rFonts w:hint="eastAsia"/>
-          <w:b/>
-          <w:bCs/>
+        <w:jc w:val="center"/>
+        <w:rPr>
+          <w:rFonts w:hint="eastAsia"/>
         </w:rPr>
       </w:pPr>
       <w:r>
@@ -619,10 +608,10 @@
         </w:rPr>
         <w:lastRenderedPageBreak/>
         <w:drawing>
-          <wp:inline distT="0" distB="0" distL="0" distR="0" wp14:anchorId="0F7DBCE8" wp14:editId="65C4C328">
-            <wp:extent cx="3557614" cy="2247916"/>
-            <wp:effectExtent l="0" t="0" r="5080" b="0"/>
-            <wp:docPr id="6" name="图片 6"/>
+          <wp:inline distT="0" distB="0" distL="0" distR="0" wp14:anchorId="5ADF5F5D" wp14:editId="3624C352">
+            <wp:extent cx="4012960" cy="2290994"/>
+            <wp:effectExtent l="0" t="0" r="6985" b="0"/>
+            <wp:docPr id="1" name="图片 1"/>
             <wp:cNvGraphicFramePr>
               <a:graphicFrameLocks xmlns:a="http://schemas.openxmlformats.org/drawingml/2006/main" noChangeAspect="1"/>
             </wp:cNvGraphicFramePr>
@@ -642,7 +631,7 @@
                   <pic:spPr>
                     <a:xfrm>
                       <a:off x="0" y="0"/>
-                      <a:ext cx="3557614" cy="2247916"/>
+                      <a:ext cx="4024757" cy="2297729"/>
                     </a:xfrm>
                     <a:prstGeom prst="rect">
                       <a:avLst/>
@@ -657,9 +646,9 @@
     </w:p>
     <w:p>
       <w:pPr>
-        <w:rPr>
-          <w:b/>
-          <w:bCs/>
+        <w:jc w:val="center"/>
+        <w:rPr>
+          <w:rFonts w:hint="eastAsia"/>
         </w:rPr>
       </w:pPr>
       <w:r>
@@ -667,10 +656,10 @@
           <w:noProof/>
         </w:rPr>
         <w:drawing>
-          <wp:inline distT="0" distB="0" distL="0" distR="0" wp14:anchorId="554008AE" wp14:editId="1499EDC7">
-            <wp:extent cx="2181241" cy="1614499"/>
-            <wp:effectExtent l="0" t="0" r="0" b="5080"/>
-            <wp:docPr id="5" name="图片 5"/>
+          <wp:inline distT="0" distB="0" distL="0" distR="0" wp14:anchorId="21CCF9B9" wp14:editId="09E7766E">
+            <wp:extent cx="4160296" cy="2478847"/>
+            <wp:effectExtent l="0" t="0" r="0" b="0"/>
+            <wp:docPr id="2" name="图片 2"/>
             <wp:cNvGraphicFramePr>
               <a:graphicFrameLocks xmlns:a="http://schemas.openxmlformats.org/drawingml/2006/main" noChangeAspect="1"/>
             </wp:cNvGraphicFramePr>
@@ -690,6 +679,522 @@
                   <pic:spPr>
                     <a:xfrm>
                       <a:off x="0" y="0"/>
+                      <a:ext cx="4163647" cy="2480843"/>
+                    </a:xfrm>
+                    <a:prstGeom prst="rect">
+                      <a:avLst/>
+                    </a:prstGeom>
+                  </pic:spPr>
+                </pic:pic>
+              </a:graphicData>
+            </a:graphic>
+          </wp:inline>
+        </w:drawing>
+      </w:r>
+    </w:p>
+    <w:p>
+      <w:pPr>
+        <w:jc w:val="center"/>
+        <w:rPr>
+          <w:rFonts w:hint="eastAsia"/>
+        </w:rPr>
+      </w:pPr>
+      <w:r>
+        <w:rPr>
+          <w:noProof/>
+        </w:rPr>
+        <w:drawing>
+          <wp:inline distT="0" distB="0" distL="0" distR="0" wp14:anchorId="00648105" wp14:editId="2AB64009">
+            <wp:extent cx="3467125" cy="2790845"/>
+            <wp:effectExtent l="0" t="0" r="0" b="9525"/>
+            <wp:docPr id="3" name="图片 3"/>
+            <wp:cNvGraphicFramePr>
+              <a:graphicFrameLocks xmlns:a="http://schemas.openxmlformats.org/drawingml/2006/main" noChangeAspect="1"/>
+            </wp:cNvGraphicFramePr>
+            <a:graphic xmlns:a="http://schemas.openxmlformats.org/drawingml/2006/main">
+              <a:graphicData uri="http://schemas.openxmlformats.org/drawingml/2006/picture">
+                <pic:pic xmlns:pic="http://schemas.openxmlformats.org/drawingml/2006/picture">
+                  <pic:nvPicPr>
+                    <pic:cNvPr id="1" name=""/>
+                    <pic:cNvPicPr/>
+                  </pic:nvPicPr>
+                  <pic:blipFill>
+                    <a:blip r:embed="rId8"/>
+                    <a:stretch>
+                      <a:fillRect/>
+                    </a:stretch>
+                  </pic:blipFill>
+                  <pic:spPr>
+                    <a:xfrm>
+                      <a:off x="0" y="0"/>
+                      <a:ext cx="3467125" cy="2790845"/>
+                    </a:xfrm>
+                    <a:prstGeom prst="rect">
+                      <a:avLst/>
+                    </a:prstGeom>
+                  </pic:spPr>
+                </pic:pic>
+              </a:graphicData>
+            </a:graphic>
+          </wp:inline>
+        </w:drawing>
+      </w:r>
+    </w:p>
+    <w:p>
+      <w:pPr>
+        <w:outlineLvl w:val="1"/>
+        <w:rPr>
+          <w:rFonts w:hint="eastAsia"/>
+          <w:b/>
+          <w:bCs/>
+          <w:sz w:val="28"/>
+          <w:szCs w:val="32"/>
+        </w:rPr>
+      </w:pPr>
+      <w:r>
+        <w:rPr>
+          <w:rFonts w:hint="eastAsia"/>
+          <w:b/>
+          <w:bCs/>
+          <w:sz w:val="28"/>
+          <w:szCs w:val="32"/>
+        </w:rPr>
+        <w:t>4.三章实验</w:t>
+      </w:r>
+      <w:r>
+        <w:rPr>
+          <w:rFonts w:hint="eastAsia"/>
+          <w:b/>
+          <w:bCs/>
+          <w:sz w:val="28"/>
+          <w:szCs w:val="32"/>
+        </w:rPr>
+        <w:t>-实验的切换</w:t>
+      </w:r>
+      <w:r>
+        <w:rPr>
+          <w:rFonts w:ascii="Segoe UI Emoji" w:hAnsi="Segoe UI Emoji" w:cs="Segoe UI Emoji" w:hint="eastAsia"/>
+          <w:b/>
+          <w:bCs/>
+          <w:sz w:val="28"/>
+          <w:szCs w:val="32"/>
+        </w:rPr>
+        <w:t>✅</w:t>
+      </w:r>
+      <w:r>
+        <w:rPr>
+          <w:rFonts w:ascii="Segoe UI Emoji" w:hAnsi="Segoe UI Emoji" w:cs="Segoe UI Emoji" w:hint="eastAsia"/>
+          <w:b/>
+          <w:bCs/>
+          <w:sz w:val="28"/>
+          <w:szCs w:val="32"/>
+        </w:rPr>
+        <w:t>️</w:t>
+      </w:r>
+    </w:p>
+    <w:p>
+      <w:pPr>
+        <w:rPr>
+          <w:rFonts w:hint="eastAsia"/>
+        </w:rPr>
+      </w:pPr>
+      <w:r>
+        <w:rPr>
+          <w:rFonts w:hint="eastAsia"/>
+        </w:rPr>
+        <w:t>- admin 实验配置页新增实验模式卡片，展示随机项和固定项；固定项可下拉调整。</w:t>
+      </w:r>
+    </w:p>
+    <w:p>
+      <w:pPr>
+        <w:rPr>
+          <w:rFonts w:hint="eastAsia"/>
+        </w:rPr>
+      </w:pPr>
+      <w:r>
+        <w:rPr>
+          <w:rFonts w:hint="eastAsia"/>
+        </w:rPr>
+        <w:t>- 指导语页改为通用说明 + 角色说明 + 当前模式条件块；AI 区标题栏显示基础版/升级</w:t>
+      </w:r>
+      <w:r>
+        <w:rPr>
+          <w:rFonts w:hint="eastAsia"/>
+        </w:rPr>
+        <w:lastRenderedPageBreak/>
+        <w:t>版 badge；实验 1 增加升级提示和 B 查看 A 信息时的 AI 状态提示。</w:t>
+      </w:r>
+    </w:p>
+    <w:p>
+      <w:pPr>
+        <w:outlineLvl w:val="1"/>
+        <w:rPr>
+          <w:rFonts w:hint="eastAsia"/>
+          <w:b/>
+          <w:bCs/>
+          <w:sz w:val="28"/>
+          <w:szCs w:val="32"/>
+        </w:rPr>
+      </w:pPr>
+      <w:r>
+        <w:rPr>
+          <w:rFonts w:hint="eastAsia"/>
+          <w:b/>
+          <w:bCs/>
+          <w:sz w:val="28"/>
+          <w:szCs w:val="32"/>
+        </w:rPr>
+        <w:t>4.</w:t>
+      </w:r>
+      <w:r>
+        <w:rPr>
+          <w:rFonts w:hint="eastAsia"/>
+          <w:b/>
+          <w:bCs/>
+          <w:sz w:val="28"/>
+          <w:szCs w:val="32"/>
+        </w:rPr>
+        <w:t>变量记录模块</w:t>
+      </w:r>
+      <w:r>
+        <w:rPr>
+          <w:rFonts w:ascii="Segoe UI Emoji" w:hAnsi="Segoe UI Emoji" w:cs="Segoe UI Emoji" w:hint="eastAsia"/>
+          <w:b/>
+          <w:bCs/>
+          <w:sz w:val="28"/>
+          <w:szCs w:val="32"/>
+        </w:rPr>
+        <w:t>✅</w:t>
+      </w:r>
+      <w:r>
+        <w:rPr>
+          <w:rFonts w:ascii="Segoe UI Emoji" w:hAnsi="Segoe UI Emoji" w:cs="Segoe UI Emoji" w:hint="eastAsia"/>
+          <w:b/>
+          <w:bCs/>
+          <w:sz w:val="28"/>
+          <w:szCs w:val="32"/>
+        </w:rPr>
+        <w:t>️</w:t>
+      </w:r>
+    </w:p>
+    <w:p>
+      <w:pPr>
+        <w:ind w:firstLineChars="202" w:firstLine="424"/>
+        <w:rPr>
+          <w:rFonts w:hint="eastAsia"/>
+        </w:rPr>
+      </w:pPr>
+      <w:r>
+        <w:rPr>
+          <w:rFonts w:hint="eastAsia"/>
+        </w:rPr>
+        <w:t>然后 完成下一个任务：变量记录模块</w:t>
+      </w:r>
+    </w:p>
+    <w:p>
+      <w:pPr>
+        <w:ind w:firstLineChars="202" w:firstLine="424"/>
+        <w:rPr>
+          <w:rFonts w:hint="eastAsia"/>
+        </w:rPr>
+      </w:pPr>
+      <w:r>
+        <w:rPr>
+          <w:rFonts w:hint="eastAsia"/>
+        </w:rPr>
+        <w:t>1.任务目标：我们是一个实验平台，目前要先梳理实验流程明白我们要记录哪些指标（尽可能丰富记录）</w:t>
+      </w:r>
+    </w:p>
+    <w:p>
+      <w:pPr>
+        <w:ind w:firstLineChars="202" w:firstLine="424"/>
+        <w:rPr>
+          <w:rFonts w:hint="eastAsia"/>
+        </w:rPr>
+      </w:pPr>
+      <w:r>
+        <w:rPr>
+          <w:rFonts w:hint="eastAsia"/>
+        </w:rPr>
+        <w:t>1.1必须要实现的是能算出我们的变量，别到时候直接实验变量都算不出来了</w:t>
+      </w:r>
+    </w:p>
+    <w:p>
+      <w:pPr>
+        <w:ind w:firstLineChars="202" w:firstLine="424"/>
+        <w:rPr>
+          <w:rFonts w:hint="eastAsia"/>
+        </w:rPr>
+      </w:pPr>
+      <w:r>
+        <w:rPr>
+          <w:rFonts w:hint="eastAsia"/>
+        </w:rPr>
+        <w:t>1.2尽可能多记录额外信息，比如说时间戳</w:t>
+      </w:r>
+    </w:p>
+    <w:p>
+      <w:pPr>
+        <w:ind w:firstLineChars="202" w:firstLine="424"/>
+        <w:rPr>
+          <w:rFonts w:hint="eastAsia"/>
+        </w:rPr>
+      </w:pPr>
+      <w:r>
+        <w:rPr>
+          <w:rFonts w:hint="eastAsia"/>
+        </w:rPr>
+        <w:t>1.3同时，使最后的记录方案尽可能的结构化（比如json？我不太清楚一般是怎么记录的）</w:t>
+      </w:r>
+    </w:p>
+    <w:p>
+      <w:pPr>
+        <w:ind w:firstLineChars="202" w:firstLine="424"/>
+        <w:rPr>
+          <w:rFonts w:hint="eastAsia"/>
+        </w:rPr>
+      </w:pPr>
+      <w:r>
+        <w:rPr>
+          <w:rFonts w:hint="eastAsia"/>
+        </w:rPr>
+        <w:t>1.4最后可以直接通过admin导出实验数据，每一个被试一个json记录这样子的</w:t>
+      </w:r>
+    </w:p>
+    <w:p>
+      <w:pPr>
+        <w:ind w:firstLineChars="202" w:firstLine="424"/>
+        <w:rPr>
+          <w:rFonts w:hint="eastAsia"/>
+        </w:rPr>
+      </w:pPr>
+      <w:r>
+        <w:rPr>
+          <w:rFonts w:hint="eastAsia"/>
+        </w:rPr>
+        <w:t>2.任务流程</w:t>
+      </w:r>
+    </w:p>
+    <w:p>
+      <w:pPr>
+        <w:ind w:firstLineChars="202" w:firstLine="424"/>
+        <w:rPr>
+          <w:rFonts w:hint="eastAsia"/>
+        </w:rPr>
+      </w:pPr>
+      <w:r>
+        <w:rPr>
+          <w:rFonts w:hint="eastAsia"/>
+        </w:rPr>
+        <w:t>2.1我估计这一块需要我们做一个详细详细的实验流程梳理，然后把每一步都思考有什么可以记录的参数都记下来，后面再搞变量计算之类的（这里的流程应该可以看appflow之类的？）</w:t>
+      </w:r>
+    </w:p>
+    <w:p>
+      <w:pPr>
+        <w:ind w:firstLineChars="202" w:firstLine="424"/>
+        <w:rPr>
+          <w:rFonts w:hint="eastAsia"/>
+        </w:rPr>
+      </w:pPr>
+      <w:r>
+        <w:rPr>
+          <w:rFonts w:hint="eastAsia"/>
+        </w:rPr>
+        <w:t>2.2"E:\Own_program\multi cooperation\00_start_materials\第五次开会\D变量表_整理版.md" 这里有一版师兄给的方案，但是这是他和ai搞的，可能有点冗余，只能选择性借鉴！</w:t>
+      </w:r>
+    </w:p>
+    <w:p>
+      <w:pPr>
+        <w:ind w:firstLineChars="202" w:firstLine="424"/>
+        <w:rPr>
+          <w:rFonts w:hint="eastAsia"/>
+        </w:rPr>
+      </w:pPr>
+    </w:p>
+    <w:p>
+      <w:pPr>
+        <w:ind w:firstLineChars="202" w:firstLine="424"/>
+        <w:rPr>
+          <w:rFonts w:hint="eastAsia"/>
+        </w:rPr>
+      </w:pPr>
+      <w:r>
+        <w:rPr>
+          <w:rFonts w:hint="eastAsia"/>
+        </w:rPr>
+        <w:t>3.这里也牵扯到数据库的设计，"E:\Own_program\multi cooperation\02_specs\04_pre_deploy"这里之前思考过一版本</w:t>
+      </w:r>
+    </w:p>
+    <w:p>
+      <w:pPr>
+        <w:ind w:firstLineChars="202" w:firstLine="424"/>
+        <w:rPr>
+          <w:rFonts w:hint="eastAsia"/>
+        </w:rPr>
+      </w:pPr>
+      <w:r>
+        <w:rPr>
+          <w:rFonts w:hint="eastAsia"/>
+        </w:rPr>
+        <w:t>同时也牵扯到上线的事宜，我们要为以后的上线留出余地来or接口来</w:t>
+      </w:r>
+    </w:p>
+    <w:p>
+      <w:pPr>
+        <w:ind w:firstLineChars="202" w:firstLine="424"/>
+        <w:rPr>
+          <w:rFonts w:hint="eastAsia"/>
+        </w:rPr>
+      </w:pPr>
+    </w:p>
+    <w:p>
+      <w:pPr>
+        <w:ind w:firstLineChars="202" w:firstLine="424"/>
+        <w:rPr>
+          <w:rFonts w:hint="eastAsia"/>
+        </w:rPr>
+      </w:pPr>
+      <w:r>
+        <w:rPr>
+          <w:rFonts w:hint="eastAsia"/>
+        </w:rPr>
+        <w:t>让我们来思考下这里的变量记录；数据库设计；上线对接等等方案！</w:t>
+      </w:r>
+    </w:p>
+    <w:p>
+      <w:pPr>
+        <w:outlineLvl w:val="1"/>
+        <w:rPr>
+          <w:rFonts w:hint="eastAsia"/>
+        </w:rPr>
+      </w:pPr>
+      <w:r>
+        <w:rPr>
+          <w:rFonts w:hint="eastAsia"/>
+          <w:b/>
+          <w:bCs/>
+          <w:sz w:val="28"/>
+          <w:szCs w:val="32"/>
+        </w:rPr>
+        <w:t>5.</w:t>
+      </w:r>
+      <w:r>
+        <w:rPr>
+          <w:rFonts w:hint="eastAsia"/>
+          <w:b/>
+          <w:bCs/>
+          <w:sz w:val="28"/>
+          <w:szCs w:val="32"/>
+        </w:rPr>
+        <w:t>服务器与域名事宜</w:t>
+      </w:r>
+      <w:r>
+        <w:rPr>
+          <w:rFonts w:ascii="Segoe UI Emoji" w:hAnsi="Segoe UI Emoji" w:cs="Segoe UI Emoji" w:hint="eastAsia"/>
+          <w:b/>
+          <w:bCs/>
+          <w:sz w:val="28"/>
+          <w:szCs w:val="32"/>
+        </w:rPr>
+        <w:t>✅</w:t>
+      </w:r>
+      <w:r>
+        <w:rPr>
+          <w:rFonts w:ascii="Segoe UI Emoji" w:hAnsi="Segoe UI Emoji" w:cs="Segoe UI Emoji" w:hint="eastAsia"/>
+          <w:b/>
+          <w:bCs/>
+          <w:sz w:val="28"/>
+          <w:szCs w:val="32"/>
+        </w:rPr>
+        <w:t>️</w:t>
+      </w:r>
+    </w:p>
+    <w:p>
+      <w:pPr>
+        <w:rPr>
+          <w:rFonts w:hint="eastAsia"/>
+          <w:b/>
+          <w:bCs/>
+        </w:rPr>
+      </w:pPr>
+      <w:r>
+        <w:rPr>
+          <w:noProof/>
+        </w:rPr>
+        <w:drawing>
+          <wp:inline distT="0" distB="0" distL="0" distR="0" wp14:anchorId="0F7DBCE8" wp14:editId="65C4C328">
+            <wp:extent cx="3557614" cy="2247916"/>
+            <wp:effectExtent l="0" t="0" r="5080" b="0"/>
+            <wp:docPr id="6" name="图片 6"/>
+            <wp:cNvGraphicFramePr>
+              <a:graphicFrameLocks xmlns:a="http://schemas.openxmlformats.org/drawingml/2006/main" noChangeAspect="1"/>
+            </wp:cNvGraphicFramePr>
+            <a:graphic xmlns:a="http://schemas.openxmlformats.org/drawingml/2006/main">
+              <a:graphicData uri="http://schemas.openxmlformats.org/drawingml/2006/picture">
+                <pic:pic xmlns:pic="http://schemas.openxmlformats.org/drawingml/2006/picture">
+                  <pic:nvPicPr>
+                    <pic:cNvPr id="1" name=""/>
+                    <pic:cNvPicPr/>
+                  </pic:nvPicPr>
+                  <pic:blipFill>
+                    <a:blip r:embed="rId9"/>
+                    <a:stretch>
+                      <a:fillRect/>
+                    </a:stretch>
+                  </pic:blipFill>
+                  <pic:spPr>
+                    <a:xfrm>
+                      <a:off x="0" y="0"/>
+                      <a:ext cx="3557614" cy="2247916"/>
+                    </a:xfrm>
+                    <a:prstGeom prst="rect">
+                      <a:avLst/>
+                    </a:prstGeom>
+                  </pic:spPr>
+                </pic:pic>
+              </a:graphicData>
+            </a:graphic>
+          </wp:inline>
+        </w:drawing>
+      </w:r>
+    </w:p>
+    <w:p>
+      <w:pPr>
+        <w:rPr>
+          <w:rFonts w:hint="eastAsia"/>
+          <w:b/>
+          <w:bCs/>
+        </w:rPr>
+      </w:pPr>
+      <w:r>
+        <w:rPr>
+          <w:noProof/>
+        </w:rPr>
+        <w:lastRenderedPageBreak/>
+        <w:drawing>
+          <wp:inline distT="0" distB="0" distL="0" distR="0" wp14:anchorId="554008AE" wp14:editId="1499EDC7">
+            <wp:extent cx="2181241" cy="1614499"/>
+            <wp:effectExtent l="0" t="0" r="0" b="5080"/>
+            <wp:docPr id="5" name="图片 5"/>
+            <wp:cNvGraphicFramePr>
+              <a:graphicFrameLocks xmlns:a="http://schemas.openxmlformats.org/drawingml/2006/main" noChangeAspect="1"/>
+            </wp:cNvGraphicFramePr>
+            <a:graphic xmlns:a="http://schemas.openxmlformats.org/drawingml/2006/main">
+              <a:graphicData uri="http://schemas.openxmlformats.org/drawingml/2006/picture">
+                <pic:pic xmlns:pic="http://schemas.openxmlformats.org/drawingml/2006/picture">
+                  <pic:nvPicPr>
+                    <pic:cNvPr id="1" name=""/>
+                    <pic:cNvPicPr/>
+                  </pic:nvPicPr>
+                  <pic:blipFill>
+                    <a:blip r:embed="rId10"/>
+                    <a:stretch>
+                      <a:fillRect/>
+                    </a:stretch>
+                  </pic:blipFill>
+                  <pic:spPr>
+                    <a:xfrm>
+                      <a:off x="0" y="0"/>
                       <a:ext cx="2181241" cy="1614499"/>
                     </a:xfrm>
                     <a:prstGeom prst="rect">
@@ -913,20 +1418,80 @@
           <w:sz w:val="28"/>
           <w:szCs w:val="32"/>
         </w:rPr>
-        <w:t>待办1.评分系统</w:t>
-      </w:r>
-    </w:p>
-    <w:p>
-      <w:pPr>
-        <w:rPr>
-          <w:rFonts w:hint="eastAsia"/>
-        </w:rPr>
-      </w:pPr>
-      <w:r>
-        <w:rPr>
-          <w:rFonts w:hint="eastAsia"/>
-        </w:rPr>
-        <w:t>评分系统</w:t>
+        <w:t>待办1.</w:t>
+      </w:r>
+      <w:r>
+        <w:rPr>
+          <w:rFonts w:hint="eastAsia"/>
+          <w:b/>
+          <w:bCs/>
+          <w:sz w:val="28"/>
+          <w:szCs w:val="32"/>
+        </w:rPr>
+        <w:t>对变量保存</w:t>
+      </w:r>
+      <w:r>
+        <w:rPr>
+          <w:rFonts w:hint="eastAsia"/>
+          <w:b/>
+          <w:bCs/>
+          <w:sz w:val="28"/>
+          <w:szCs w:val="32"/>
+        </w:rPr>
+        <w:t>系统的</w:t>
+      </w:r>
+      <w:r>
+        <w:rPr>
+          <w:rFonts w:hint="eastAsia"/>
+          <w:b/>
+          <w:bCs/>
+          <w:sz w:val="28"/>
+          <w:szCs w:val="32"/>
+        </w:rPr>
+        <w:t>尽善尽美</w:t>
+      </w:r>
+    </w:p>
+    <w:p>
+      <w:pPr>
+        <w:rPr>
+          <w:rFonts w:hint="eastAsia"/>
+        </w:rPr>
+      </w:pPr>
+      <w:r>
+        <w:rPr>
+          <w:rFonts w:hint="eastAsia"/>
+        </w:rPr>
+        <w:t>查看</w:t>
+      </w:r>
+      <w:r>
+        <w:rPr>
+          <w:rFonts w:hint="eastAsia"/>
+        </w:rPr>
+        <w:t>"E:\Own_program\multi cooperation\02_specs\04_pre_deploy\变量记录与服务器导出方案.md"</w:t>
+      </w:r>
+      <w:r>
+        <w:rPr>
+          <w:rFonts w:hint="eastAsia"/>
+        </w:rPr>
+        <w:t>的【第五步】，这是对</w:t>
+      </w:r>
+      <w:r>
+        <w:rPr>
+          <w:rFonts w:hint="eastAsia"/>
+        </w:rPr>
+        <w:t>"E:\Own_program\multi cooperation\00_start_materials\第五次开会\D变量表_整理版.md"</w:t>
+      </w:r>
+      <w:r>
+        <w:rPr>
+          <w:rFonts w:hint="eastAsia"/>
+        </w:rPr>
+        <w:t>这个的整理归纳。比如</w:t>
+      </w:r>
+      <w:r>
+        <w:rPr>
+          <w:rFonts w:hint="eastAsia"/>
+        </w:rPr>
+        <w:t>内容质量评分、gold fact/gold issue、复制粘贴滚动 focus/blur 这类细粒度行为、AI 采纳率，都需要以后单独有原始来源或评分系统。第一版数据库不要为了这些论文变量名膨胀，先把原始记录层做优雅。</w:t>
       </w:r>
     </w:p>
     <w:p>
@@ -960,13 +1525,208 @@
         </w:rPr>
         <w:t>测试轮+教学页面的流程</w:t>
       </w:r>
-    </w:p>
-    <w:p>
-      <w:pPr>
-        <w:rPr>
-          <w:rFonts w:hint="eastAsia"/>
-        </w:rPr>
-      </w:pPr>
+      <w:r>
+        <w:rPr>
+          <w:rFonts w:hint="eastAsia"/>
+          <w:b/>
+          <w:bCs/>
+          <w:sz w:val="28"/>
+          <w:szCs w:val="32"/>
+        </w:rPr>
+        <w:t xml:space="preserve"> </w:t>
+      </w:r>
+      <w:r>
+        <w:rPr>
+          <w:rFonts w:hint="eastAsia"/>
+          <w:b/>
+          <w:bCs/>
+          <w:sz w:val="28"/>
+          <w:szCs w:val="32"/>
+        </w:rPr>
+        <w:t xml:space="preserve"> </w:t>
+      </w:r>
+      <w:r>
+        <w:rPr>
+          <w:rFonts w:ascii="Segoe UI Emoji" w:hAnsi="Segoe UI Emoji" w:cs="Segoe UI Emoji" w:hint="eastAsia"/>
+          <w:b/>
+          <w:bCs/>
+          <w:sz w:val="28"/>
+          <w:szCs w:val="32"/>
+        </w:rPr>
+        <w:t>✅</w:t>
+      </w:r>
+      <w:r>
+        <w:rPr>
+          <w:rFonts w:ascii="Segoe UI Emoji" w:hAnsi="Segoe UI Emoji" w:cs="Segoe UI Emoji" w:hint="eastAsia"/>
+          <w:b/>
+          <w:bCs/>
+          <w:sz w:val="28"/>
+          <w:szCs w:val="32"/>
+        </w:rPr>
+        <w:t>️</w:t>
+      </w:r>
+    </w:p>
+    <w:p>
+      <w:pPr>
+        <w:rPr>
+          <w:rFonts w:hint="eastAsia"/>
+        </w:rPr>
+      </w:pPr>
+      <w:r>
+        <w:rPr>
+          <w:rFonts w:hint="eastAsia"/>
+        </w:rPr>
+        <w:t>测试题（选择题，全选对可以进入测试轮）+测试轮（做一家公司，流程等同正式轮，唯一区别是不计分）</w:t>
+      </w:r>
+    </w:p>
+    <w:p>
+      <w:pPr>
+        <w:rPr>
+          <w:rFonts w:hint="eastAsia"/>
+        </w:rPr>
+      </w:pPr>
+      <w:r>
+        <w:rPr>
+          <w:rFonts w:hint="eastAsia"/>
+        </w:rPr>
+        <w:t>1.测试题就是用休息问卷页</w:t>
+      </w:r>
+    </w:p>
+    <w:p>
+      <w:pPr>
+        <w:rPr>
+          <w:rFonts w:hint="eastAsia"/>
+        </w:rPr>
+      </w:pPr>
+      <w:r>
+        <w:rPr>
+          <w:rFonts w:hint="eastAsia"/>
+        </w:rPr>
+        <w:t>2.测试轮就用 正式页面放一家公司</w:t>
+      </w:r>
+    </w:p>
+    <w:p>
+      <w:pPr>
+        <w:rPr>
+          <w:rFonts w:hint="eastAsia"/>
+        </w:rPr>
+      </w:pPr>
+      <w:r>
+        <w:rPr>
+          <w:rFonts w:hint="eastAsia"/>
+        </w:rPr>
+        <w:t xml:space="preserve">     时间A5分钟 B则是正常测试轮的限时</w:t>
+      </w:r>
+    </w:p>
+    <w:p>
+      <w:pPr>
+        <w:rPr>
+          <w:rFonts w:hint="eastAsia"/>
+        </w:rPr>
+      </w:pPr>
+      <w:r>
+        <w:rPr>
+          <w:rFonts w:hint="eastAsia"/>
+        </w:rPr>
+        <w:t>3.教学页面我先自己搞着试试，模仿力扣</w:t>
+      </w:r>
+    </w:p>
+    <w:p>
+      <w:pPr>
+        <w:jc w:val="center"/>
+        <w:rPr>
+          <w:rFonts w:hint="eastAsia"/>
+        </w:rPr>
+      </w:pPr>
+      <w:r>
+        <w:rPr>
+          <w:noProof/>
+        </w:rPr>
+        <w:lastRenderedPageBreak/>
+        <w:drawing>
+          <wp:inline distT="0" distB="0" distL="0" distR="0" wp14:anchorId="718C834B" wp14:editId="2142B58E">
+            <wp:extent cx="3748607" cy="2349273"/>
+            <wp:effectExtent l="0" t="0" r="4445" b="0"/>
+            <wp:docPr id="4" name="图片 4"/>
+            <wp:cNvGraphicFramePr>
+              <a:graphicFrameLocks xmlns:a="http://schemas.openxmlformats.org/drawingml/2006/main" noChangeAspect="1"/>
+            </wp:cNvGraphicFramePr>
+            <a:graphic xmlns:a="http://schemas.openxmlformats.org/drawingml/2006/main">
+              <a:graphicData uri="http://schemas.openxmlformats.org/drawingml/2006/picture">
+                <pic:pic xmlns:pic="http://schemas.openxmlformats.org/drawingml/2006/picture">
+                  <pic:nvPicPr>
+                    <pic:cNvPr id="1" name=""/>
+                    <pic:cNvPicPr/>
+                  </pic:nvPicPr>
+                  <pic:blipFill>
+                    <a:blip r:embed="rId11"/>
+                    <a:stretch>
+                      <a:fillRect/>
+                    </a:stretch>
+                  </pic:blipFill>
+                  <pic:spPr>
+                    <a:xfrm>
+                      <a:off x="0" y="0"/>
+                      <a:ext cx="3753543" cy="2352367"/>
+                    </a:xfrm>
+                    <a:prstGeom prst="rect">
+                      <a:avLst/>
+                    </a:prstGeom>
+                  </pic:spPr>
+                </pic:pic>
+              </a:graphicData>
+            </a:graphic>
+          </wp:inline>
+        </w:drawing>
+      </w:r>
+    </w:p>
+    <w:p>
+      <w:pPr>
+        <w:jc w:val="center"/>
+        <w:rPr>
+          <w:rFonts w:hint="eastAsia"/>
+        </w:rPr>
+      </w:pPr>
+      <w:r>
+        <w:rPr>
+          <w:noProof/>
+        </w:rPr>
+        <w:drawing>
+          <wp:inline distT="0" distB="0" distL="0" distR="0" wp14:anchorId="39454CD5" wp14:editId="536C6601">
+            <wp:extent cx="5274310" cy="1772920"/>
+            <wp:effectExtent l="0" t="0" r="2540" b="0"/>
+            <wp:docPr id="7" name="图片 7"/>
+            <wp:cNvGraphicFramePr>
+              <a:graphicFrameLocks xmlns:a="http://schemas.openxmlformats.org/drawingml/2006/main" noChangeAspect="1"/>
+            </wp:cNvGraphicFramePr>
+            <a:graphic xmlns:a="http://schemas.openxmlformats.org/drawingml/2006/main">
+              <a:graphicData uri="http://schemas.openxmlformats.org/drawingml/2006/picture">
+                <pic:pic xmlns:pic="http://schemas.openxmlformats.org/drawingml/2006/picture">
+                  <pic:nvPicPr>
+                    <pic:cNvPr id="1" name=""/>
+                    <pic:cNvPicPr/>
+                  </pic:nvPicPr>
+                  <pic:blipFill>
+                    <a:blip r:embed="rId12"/>
+                    <a:stretch>
+                      <a:fillRect/>
+                    </a:stretch>
+                  </pic:blipFill>
+                  <pic:spPr>
+                    <a:xfrm>
+                      <a:off x="0" y="0"/>
+                      <a:ext cx="5274310" cy="1772920"/>
+                    </a:xfrm>
+                    <a:prstGeom prst="rect">
+                      <a:avLst/>
+                    </a:prstGeom>
+                  </pic:spPr>
+                </pic:pic>
+              </a:graphicData>
+            </a:graphic>
+          </wp:inline>
+        </w:drawing>
+      </w:r>
     </w:p>
     <w:p>
       <w:pPr>
@@ -991,6 +1751,11 @@
       </w:r>
     </w:p>
     <w:p>
+      <w:pPr>
+        <w:rPr>
+          <w:rFonts w:hint="eastAsia"/>
+        </w:rPr>
+      </w:pPr>
       <w:r>
         <w:rPr>
           <w:rFonts w:hint="eastAsia"/>
@@ -1032,10 +1797,80 @@
     </w:p>
     <w:p>
       <w:pPr>
-        <w:rPr>
-          <w:rFonts w:hint="eastAsia"/>
-        </w:rPr>
-      </w:pPr>
+        <w:outlineLvl w:val="1"/>
+        <w:rPr>
+          <w:rFonts w:hint="eastAsia"/>
+          <w:b/>
+          <w:bCs/>
+          <w:sz w:val="28"/>
+          <w:szCs w:val="32"/>
+        </w:rPr>
+      </w:pPr>
+      <w:r>
+        <w:rPr>
+          <w:rFonts w:hint="eastAsia"/>
+          <w:b/>
+          <w:bCs/>
+          <w:sz w:val="28"/>
+          <w:szCs w:val="32"/>
+        </w:rPr>
+        <w:t>待办</w:t>
+      </w:r>
+      <w:r>
+        <w:rPr>
+          <w:rFonts w:hint="eastAsia"/>
+          <w:b/>
+          <w:bCs/>
+          <w:sz w:val="28"/>
+          <w:szCs w:val="32"/>
+        </w:rPr>
+        <w:t>5 稳健性设计</w:t>
+      </w:r>
+    </w:p>
+    <w:p>
+      <w:pPr>
+        <w:rPr>
+          <w:rFonts w:hint="eastAsia"/>
+        </w:rPr>
+      </w:pPr>
+      <w:r>
+        <w:rPr>
+          <w:rFonts w:hint="eastAsia"/>
+        </w:rPr>
+        <w:t>其他人是怎么做的呢，无论因为什么原因-服务器出问题-网路出问题乱七八糟的如何实现断点续答or其他稳健性操作呢，这真是个好问题</w:t>
+      </w:r>
+    </w:p>
+    <w:p>
+      <w:pPr>
+        <w:outlineLvl w:val="1"/>
+        <w:rPr>
+          <w:rFonts w:hint="eastAsia"/>
+          <w:b/>
+          <w:bCs/>
+          <w:sz w:val="28"/>
+          <w:szCs w:val="32"/>
+        </w:rPr>
+      </w:pPr>
+      <w:r>
+        <w:rPr>
+          <w:rFonts w:hint="eastAsia"/>
+          <w:b/>
+          <w:bCs/>
+          <w:sz w:val="28"/>
+          <w:szCs w:val="32"/>
+        </w:rPr>
+        <w:t>待办</w:t>
+      </w:r>
+      <w:r>
+        <w:rPr>
+          <w:rFonts w:hint="eastAsia"/>
+          <w:b/>
+          <w:bCs/>
+          <w:sz w:val="28"/>
+          <w:szCs w:val="32"/>
+        </w:rPr>
+        <w:t>6 上线工作</w:t>
+      </w:r>
     </w:p>
     <w:sectPr>
       <w:pgSz w:w="11906" w:h="16838"/>
@@ -1501,7 +2336,7 @@
   <w:style w:type="paragraph" w:default="1" w:styleId="a">
     <w:name w:val="Normal"/>
     <w:qFormat/>
-    <w:rsid w:val="00C07F14"/>
+    <w:rsid w:val="00F43EBC"/>
     <w:pPr>
       <w:widowControl w:val="0"/>
       <w:jc w:val="both"/>

</xml_diff>